<commit_message>
docs: atualizar pre-projeto com secao de implementacao e resultados
</commit_message>
<xml_diff>
--- a/docs/pre-projeto-mecanizacao.docx
+++ b/docs/pre-projeto-mecanizacao.docx
@@ -1876,6 +1876,1270 @@
           <w:szCs w:val="22"/>
         </w:rPr>
         <w:t xml:space="preserve">Duas limitações centrais devem ser consideradas. Primeiramente, o tempo de resposta do sequenciamento 16S rRNA é incompatível com a necessidade de decisão em tempo real no campo, o que restringe, nesta etapa, o sistema a um uso de diagnóstico prévio à safra ou a intervalos de reamostragem periódica, e não a um acionamento instantâneo durante a operação de pulverização. Em segundo lugar, os próprios resultados de Hagen et al. (2024) mostram redução de desempenho do classificador quando testado em um dataset independente (acurácia de 0,854 no subconjunto Late Drought e de 0,768 no subconjunto Progressive Drought, ambos inferiores aos 0,923 obtidos no dataset de treinamento), o que indica sensibilidade do modelo a fatores como espécie cultivada, local de coleta e estágio do estresse hídrico. Este pré-projeto assume essas limitações como parâmetros de risco a serem tratados em etapas futuras de validação, e não como evidência contrária à viabilidade da proposta.</w:t>
+      </w:r>
+    </w:p>
+    <w:p>
+      <w:pPr>
+        <w:pStyle w:val="Heading1"/>
+        <w:spacing w:after="160" w:before="320"/>
+      </w:pPr>
+      <w:r>
+        <w:rPr>
+          <w:rFonts w:ascii="Calibri" w:cs="Calibri" w:eastAsia="Calibri" w:hAnsi="Calibri"/>
+          <w:b/>
+          <w:bCs/>
+          <w:sz w:val="26"/>
+          <w:szCs w:val="26"/>
+        </w:rPr>
+        <w:t xml:space="preserve">10. Implementação computacional e resultados obtidos</w:t>
+      </w:r>
+    </w:p>
+    <w:p>
+      <w:pPr>
+        <w:spacing w:after="160" w:line="276"/>
+        <w:jc w:val="both"/>
+      </w:pPr>
+      <w:r>
+        <w:rPr>
+          <w:rFonts w:ascii="Calibri" w:cs="Calibri" w:eastAsia="Calibri" w:hAnsi="Calibri"/>
+          <w:i w:val="false"/>
+          <w:iCs w:val="false"/>
+          <w:sz w:val="22"/>
+          <w:szCs w:val="22"/>
+        </w:rPr>
+        <w:t xml:space="preserve">A metodologia descrita nas seções anteriores foi implementada como um pipeline de software completo, organizado em módulos independentes e testados, disponibilizado em repositório próprio no GitHub. Esta seção descreve a implementação e reporta os resultados obtidos em uma execução de referência do pipeline.</w:t>
+      </w:r>
+    </w:p>
+    <w:p>
+      <w:pPr>
+        <w:pStyle w:val="Heading2"/>
+        <w:spacing w:after="120" w:before="220"/>
+      </w:pPr>
+      <w:r>
+        <w:rPr>
+          <w:rFonts w:ascii="Calibri" w:cs="Calibri" w:eastAsia="Calibri" w:hAnsi="Calibri"/>
+          <w:b/>
+          <w:bCs/>
+          <w:sz w:val="23"/>
+          <w:szCs w:val="23"/>
+        </w:rPr>
+        <w:t xml:space="preserve">10.1 Estrutura do repositório</w:t>
+      </w:r>
+    </w:p>
+    <w:p>
+      <w:pPr>
+        <w:spacing w:after="160" w:line="276"/>
+        <w:jc w:val="both"/>
+      </w:pPr>
+      <w:r>
+        <w:rPr>
+          <w:rFonts w:ascii="Calibri" w:cs="Calibri" w:eastAsia="Calibri" w:hAnsi="Calibri"/>
+          <w:i w:val="false"/>
+          <w:iCs w:val="false"/>
+          <w:sz w:val="22"/>
+          <w:szCs w:val="22"/>
+        </w:rPr>
+        <w:t xml:space="preserve">O código-fonte foi organizado em seis módulos, cada um correspondente a uma etapa da metodologia (seção 5): (1) obtenção de dados, (2) modelagem preditiva, (3) interpretabilidade, (4) mapa de prescrição, (5) simulação de aplicação em taxa variável, e (6) um orquestrador que executa as etapas em sequência e consolida os artefatos de saída (tabela de features, métricas, táxons marcadores, mapa de prescrição em CSV e em imagem, e um relatório-resumo). O repositório inclui também uma suíte de testes automatizados (pytest), que verifica a integridade estatística de cada etapa (por exemplo, que as abundâncias relativas somam 1 por amostra, que as métricas do classificador estão no intervalo [0, 1] e que a dose de bioinsumo cresce de forma monotônica com a probabilidade de estresse prevista).</w:t>
+      </w:r>
+    </w:p>
+    <w:p>
+      <w:pPr>
+        <w:pStyle w:val="Heading2"/>
+        <w:spacing w:after="120" w:before="220"/>
+      </w:pPr>
+      <w:r>
+        <w:rPr>
+          <w:rFonts w:ascii="Calibri" w:cs="Calibri" w:eastAsia="Calibri" w:hAnsi="Calibri"/>
+          <w:b/>
+          <w:bCs/>
+          <w:sz w:val="23"/>
+          <w:szCs w:val="23"/>
+        </w:rPr>
+        <w:t xml:space="preserve">10.2 Dados utilizados na execução de referência</w:t>
+      </w:r>
+    </w:p>
+    <w:p>
+      <w:pPr>
+        <w:spacing w:after="160" w:line="276"/>
+        <w:jc w:val="both"/>
+      </w:pPr>
+      <w:r>
+        <w:rPr>
+          <w:rFonts w:ascii="Calibri" w:cs="Calibri" w:eastAsia="Calibri" w:hAnsi="Calibri"/>
+          <w:i w:val="false"/>
+          <w:iCs w:val="false"/>
+          <w:sz w:val="22"/>
+          <w:szCs w:val="22"/>
+        </w:rPr>
+        <w:t xml:space="preserve">Como o processamento do dataset real ("Grass-Drought", BioProject PRJNA369551) depende de ferramentas de bioinformática (SRA Toolkit, DADA2 em R) e de acesso à rede do NCBI não disponíveis no ambiente de desenvolvimento utilizado, o módulo de dados gera uma tabela sintética com a mesma estrutura estatística do dataset original: amostras rotuladas "Controle"/"Seca", abundâncias relativas de um conjunto de gêneros bacterianos (parte deles desenhada para responder ao regime hídrico, simulando os marcadores relatados por Hagen et al., 2024) e coordenadas espaciais dentro de um talhão hipotético, com um leve gradiente espacial de suscetibilidade à seca. O repositório documenta, em `docs/methodology.md`, o procedimento para substituir esses dados sintéticos pela tabela de features real, uma vez processada.</w:t>
+      </w:r>
+    </w:p>
+    <w:p>
+      <w:pPr>
+        <w:pStyle w:val="Heading2"/>
+        <w:spacing w:after="120" w:before="220"/>
+      </w:pPr>
+      <w:r>
+        <w:rPr>
+          <w:rFonts w:ascii="Calibri" w:cs="Calibri" w:eastAsia="Calibri" w:hAnsi="Calibri"/>
+          <w:b/>
+          <w:bCs/>
+          <w:sz w:val="23"/>
+          <w:szCs w:val="23"/>
+        </w:rPr>
+        <w:t xml:space="preserve">10.3 Desempenho do classificador</w:t>
+      </w:r>
+    </w:p>
+    <w:p>
+      <w:pPr>
+        <w:spacing w:after="160" w:line="276"/>
+        <w:jc w:val="both"/>
+      </w:pPr>
+      <w:r>
+        <w:rPr>
+          <w:rFonts w:ascii="Calibri" w:cs="Calibri" w:eastAsia="Calibri" w:hAnsi="Calibri"/>
+          <w:i w:val="false"/>
+          <w:iCs w:val="false"/>
+          <w:sz w:val="22"/>
+          <w:szCs w:val="22"/>
+        </w:rPr>
+        <w:t xml:space="preserve">A tabela a seguir reporta o desempenho médio do Random Forest Classifier na execução de referência (5-fold nested CV), sobre a tabela de dados sintéticos descrita acima:</w:t>
+      </w:r>
+    </w:p>
+    <w:tbl>
+      <w:tblPr>
+        <w:tblW w:type="dxa" w:w="9200"/>
+        <w:tblBorders>
+          <w:top w:val="single" w:color="auto" w:sz="4"/>
+          <w:left w:val="single" w:color="auto" w:sz="4"/>
+          <w:bottom w:val="single" w:color="auto" w:sz="4"/>
+          <w:right w:val="single" w:color="auto" w:sz="4"/>
+          <w:insideH w:val="single" w:color="auto" w:sz="4"/>
+          <w:insideV w:val="single" w:color="auto" w:sz="4"/>
+        </w:tblBorders>
+      </w:tblPr>
+      <w:tblGrid>
+        <w:gridCol w:w="3000"/>
+        <w:gridCol w:w="3100"/>
+        <w:gridCol w:w="3100"/>
+      </w:tblGrid>
+      <w:tr>
+        <w:tc>
+          <w:tcPr>
+            <w:tcW w:type="dxa" w:w="3000"/>
+            <w:shd w:fill="1F3864" w:val="clear"/>
+            <w:tcMar>
+              <w:top w:type="dxa" w:w="100"/>
+              <w:left w:type="dxa" w:w="120"/>
+              <w:bottom w:type="dxa" w:w="100"/>
+              <w:right w:type="dxa" w:w="120"/>
+            </w:tcMar>
+          </w:tcPr>
+          <w:p>
+            <w:r>
+              <w:rPr>
+                <w:rFonts w:ascii="Calibri" w:cs="Calibri" w:eastAsia="Calibri" w:hAnsi="Calibri"/>
+                <w:b/>
+                <w:bCs/>
+                <w:color w:val="FFFFFF"/>
+                <w:sz w:val="20"/>
+                <w:szCs w:val="20"/>
+              </w:rPr>
+              <w:t xml:space="preserve">Métrica</w:t>
+            </w:r>
+          </w:p>
+        </w:tc>
+        <w:tc>
+          <w:tcPr>
+            <w:tcW w:type="dxa" w:w="3100"/>
+            <w:shd w:fill="1F3864" w:val="clear"/>
+            <w:tcMar>
+              <w:top w:type="dxa" w:w="100"/>
+              <w:left w:type="dxa" w:w="120"/>
+              <w:bottom w:type="dxa" w:w="100"/>
+              <w:right w:type="dxa" w:w="120"/>
+            </w:tcMar>
+          </w:tcPr>
+          <w:p>
+            <w:r>
+              <w:rPr>
+                <w:rFonts w:ascii="Calibri" w:cs="Calibri" w:eastAsia="Calibri" w:hAnsi="Calibri"/>
+                <w:b/>
+                <w:bCs/>
+                <w:color w:val="FFFFFF"/>
+                <w:sz w:val="20"/>
+                <w:szCs w:val="20"/>
+              </w:rPr>
+              <w:t xml:space="preserve">Média</w:t>
+            </w:r>
+          </w:p>
+        </w:tc>
+        <w:tc>
+          <w:tcPr>
+            <w:tcW w:type="dxa" w:w="3100"/>
+            <w:shd w:fill="1F3864" w:val="clear"/>
+            <w:tcMar>
+              <w:top w:type="dxa" w:w="100"/>
+              <w:left w:type="dxa" w:w="120"/>
+              <w:bottom w:type="dxa" w:w="100"/>
+              <w:right w:type="dxa" w:w="120"/>
+            </w:tcMar>
+          </w:tcPr>
+          <w:p>
+            <w:r>
+              <w:rPr>
+                <w:rFonts w:ascii="Calibri" w:cs="Calibri" w:eastAsia="Calibri" w:hAnsi="Calibri"/>
+                <w:b/>
+                <w:bCs/>
+                <w:color w:val="FFFFFF"/>
+                <w:sz w:val="20"/>
+                <w:szCs w:val="20"/>
+              </w:rPr>
+              <w:t xml:space="preserve">Desvio padrão</w:t>
+            </w:r>
+          </w:p>
+        </w:tc>
+      </w:tr>
+      <w:tr>
+        <w:tc>
+          <w:tcPr>
+            <w:tcW w:type="dxa" w:w="3000"/>
+            <w:tcMar>
+              <w:top w:type="dxa" w:w="100"/>
+              <w:left w:type="dxa" w:w="120"/>
+              <w:bottom w:type="dxa" w:w="100"/>
+              <w:right w:type="dxa" w:w="120"/>
+            </w:tcMar>
+          </w:tcPr>
+          <w:p>
+            <w:r>
+              <w:rPr>
+                <w:rFonts w:ascii="Calibri" w:cs="Calibri" w:eastAsia="Calibri" w:hAnsi="Calibri"/>
+                <w:b w:val="false"/>
+                <w:bCs w:val="false"/>
+                <w:color w:val="000000"/>
+                <w:sz w:val="20"/>
+                <w:szCs w:val="20"/>
+              </w:rPr>
+              <w:t xml:space="preserve">Acurácia</w:t>
+            </w:r>
+          </w:p>
+        </w:tc>
+        <w:tc>
+          <w:tcPr>
+            <w:tcW w:type="dxa" w:w="3100"/>
+            <w:tcMar>
+              <w:top w:type="dxa" w:w="100"/>
+              <w:left w:type="dxa" w:w="120"/>
+              <w:bottom w:type="dxa" w:w="100"/>
+              <w:right w:type="dxa" w:w="120"/>
+            </w:tcMar>
+          </w:tcPr>
+          <w:p>
+            <w:r>
+              <w:rPr>
+                <w:rFonts w:ascii="Calibri" w:cs="Calibri" w:eastAsia="Calibri" w:hAnsi="Calibri"/>
+                <w:b w:val="false"/>
+                <w:bCs w:val="false"/>
+                <w:color w:val="000000"/>
+                <w:sz w:val="20"/>
+                <w:szCs w:val="20"/>
+              </w:rPr>
+              <w:t xml:space="preserve">0,862</w:t>
+            </w:r>
+          </w:p>
+        </w:tc>
+        <w:tc>
+          <w:tcPr>
+            <w:tcW w:type="dxa" w:w="3100"/>
+            <w:tcMar>
+              <w:top w:type="dxa" w:w="100"/>
+              <w:left w:type="dxa" w:w="120"/>
+              <w:bottom w:type="dxa" w:w="100"/>
+              <w:right w:type="dxa" w:w="120"/>
+            </w:tcMar>
+          </w:tcPr>
+          <w:p>
+            <w:r>
+              <w:rPr>
+                <w:rFonts w:ascii="Calibri" w:cs="Calibri" w:eastAsia="Calibri" w:hAnsi="Calibri"/>
+                <w:b w:val="false"/>
+                <w:bCs w:val="false"/>
+                <w:color w:val="000000"/>
+                <w:sz w:val="20"/>
+                <w:szCs w:val="20"/>
+              </w:rPr>
+              <w:t xml:space="preserve">0,014</w:t>
+            </w:r>
+          </w:p>
+        </w:tc>
+      </w:tr>
+      <w:tr>
+        <w:tc>
+          <w:tcPr>
+            <w:tcW w:type="dxa" w:w="3000"/>
+            <w:tcMar>
+              <w:top w:type="dxa" w:w="100"/>
+              <w:left w:type="dxa" w:w="120"/>
+              <w:bottom w:type="dxa" w:w="100"/>
+              <w:right w:type="dxa" w:w="120"/>
+            </w:tcMar>
+          </w:tcPr>
+          <w:p>
+            <w:r>
+              <w:rPr>
+                <w:rFonts w:ascii="Calibri" w:cs="Calibri" w:eastAsia="Calibri" w:hAnsi="Calibri"/>
+                <w:b w:val="false"/>
+                <w:bCs w:val="false"/>
+                <w:color w:val="000000"/>
+                <w:sz w:val="20"/>
+                <w:szCs w:val="20"/>
+              </w:rPr>
+              <w:t xml:space="preserve">F1-score</w:t>
+            </w:r>
+          </w:p>
+        </w:tc>
+        <w:tc>
+          <w:tcPr>
+            <w:tcW w:type="dxa" w:w="3100"/>
+            <w:tcMar>
+              <w:top w:type="dxa" w:w="100"/>
+              <w:left w:type="dxa" w:w="120"/>
+              <w:bottom w:type="dxa" w:w="100"/>
+              <w:right w:type="dxa" w:w="120"/>
+            </w:tcMar>
+          </w:tcPr>
+          <w:p>
+            <w:r>
+              <w:rPr>
+                <w:rFonts w:ascii="Calibri" w:cs="Calibri" w:eastAsia="Calibri" w:hAnsi="Calibri"/>
+                <w:b w:val="false"/>
+                <w:bCs w:val="false"/>
+                <w:color w:val="000000"/>
+                <w:sz w:val="20"/>
+                <w:szCs w:val="20"/>
+              </w:rPr>
+              <w:t xml:space="preserve">0,858</w:t>
+            </w:r>
+          </w:p>
+        </w:tc>
+        <w:tc>
+          <w:tcPr>
+            <w:tcW w:type="dxa" w:w="3100"/>
+            <w:tcMar>
+              <w:top w:type="dxa" w:w="100"/>
+              <w:left w:type="dxa" w:w="120"/>
+              <w:bottom w:type="dxa" w:w="100"/>
+              <w:right w:type="dxa" w:w="120"/>
+            </w:tcMar>
+          </w:tcPr>
+          <w:p>
+            <w:r>
+              <w:rPr>
+                <w:rFonts w:ascii="Calibri" w:cs="Calibri" w:eastAsia="Calibri" w:hAnsi="Calibri"/>
+                <w:b w:val="false"/>
+                <w:bCs w:val="false"/>
+                <w:color w:val="000000"/>
+                <w:sz w:val="20"/>
+                <w:szCs w:val="20"/>
+              </w:rPr>
+              <w:t xml:space="preserve">0,014</w:t>
+            </w:r>
+          </w:p>
+        </w:tc>
+      </w:tr>
+      <w:tr>
+        <w:tc>
+          <w:tcPr>
+            <w:tcW w:type="dxa" w:w="3000"/>
+            <w:tcMar>
+              <w:top w:type="dxa" w:w="100"/>
+              <w:left w:type="dxa" w:w="120"/>
+              <w:bottom w:type="dxa" w:w="100"/>
+              <w:right w:type="dxa" w:w="120"/>
+            </w:tcMar>
+          </w:tcPr>
+          <w:p>
+            <w:r>
+              <w:rPr>
+                <w:rFonts w:ascii="Calibri" w:cs="Calibri" w:eastAsia="Calibri" w:hAnsi="Calibri"/>
+                <w:b w:val="false"/>
+                <w:bCs w:val="false"/>
+                <w:color w:val="000000"/>
+                <w:sz w:val="20"/>
+                <w:szCs w:val="20"/>
+              </w:rPr>
+              <w:t xml:space="preserve">Precisão</w:t>
+            </w:r>
+          </w:p>
+        </w:tc>
+        <w:tc>
+          <w:tcPr>
+            <w:tcW w:type="dxa" w:w="3100"/>
+            <w:tcMar>
+              <w:top w:type="dxa" w:w="100"/>
+              <w:left w:type="dxa" w:w="120"/>
+              <w:bottom w:type="dxa" w:w="100"/>
+              <w:right w:type="dxa" w:w="120"/>
+            </w:tcMar>
+          </w:tcPr>
+          <w:p>
+            <w:r>
+              <w:rPr>
+                <w:rFonts w:ascii="Calibri" w:cs="Calibri" w:eastAsia="Calibri" w:hAnsi="Calibri"/>
+                <w:b w:val="false"/>
+                <w:bCs w:val="false"/>
+                <w:color w:val="000000"/>
+                <w:sz w:val="20"/>
+                <w:szCs w:val="20"/>
+              </w:rPr>
+              <w:t xml:space="preserve">0,861</w:t>
+            </w:r>
+          </w:p>
+        </w:tc>
+        <w:tc>
+          <w:tcPr>
+            <w:tcW w:type="dxa" w:w="3100"/>
+            <w:tcMar>
+              <w:top w:type="dxa" w:w="100"/>
+              <w:left w:type="dxa" w:w="120"/>
+              <w:bottom w:type="dxa" w:w="100"/>
+              <w:right w:type="dxa" w:w="120"/>
+            </w:tcMar>
+          </w:tcPr>
+          <w:p>
+            <w:r>
+              <w:rPr>
+                <w:rFonts w:ascii="Calibri" w:cs="Calibri" w:eastAsia="Calibri" w:hAnsi="Calibri"/>
+                <w:b w:val="false"/>
+                <w:bCs w:val="false"/>
+                <w:color w:val="000000"/>
+                <w:sz w:val="20"/>
+                <w:szCs w:val="20"/>
+              </w:rPr>
+              <w:t xml:space="preserve">0,025</w:t>
+            </w:r>
+          </w:p>
+        </w:tc>
+      </w:tr>
+      <w:tr>
+        <w:tc>
+          <w:tcPr>
+            <w:tcW w:type="dxa" w:w="3000"/>
+            <w:tcMar>
+              <w:top w:type="dxa" w:w="100"/>
+              <w:left w:type="dxa" w:w="120"/>
+              <w:bottom w:type="dxa" w:w="100"/>
+              <w:right w:type="dxa" w:w="120"/>
+            </w:tcMar>
+          </w:tcPr>
+          <w:p>
+            <w:r>
+              <w:rPr>
+                <w:rFonts w:ascii="Calibri" w:cs="Calibri" w:eastAsia="Calibri" w:hAnsi="Calibri"/>
+                <w:b w:val="false"/>
+                <w:bCs w:val="false"/>
+                <w:color w:val="000000"/>
+                <w:sz w:val="20"/>
+                <w:szCs w:val="20"/>
+              </w:rPr>
+              <w:t xml:space="preserve">Recall</w:t>
+            </w:r>
+          </w:p>
+        </w:tc>
+        <w:tc>
+          <w:tcPr>
+            <w:tcW w:type="dxa" w:w="3100"/>
+            <w:tcMar>
+              <w:top w:type="dxa" w:w="100"/>
+              <w:left w:type="dxa" w:w="120"/>
+              <w:bottom w:type="dxa" w:w="100"/>
+              <w:right w:type="dxa" w:w="120"/>
+            </w:tcMar>
+          </w:tcPr>
+          <w:p>
+            <w:r>
+              <w:rPr>
+                <w:rFonts w:ascii="Calibri" w:cs="Calibri" w:eastAsia="Calibri" w:hAnsi="Calibri"/>
+                <w:b w:val="false"/>
+                <w:bCs w:val="false"/>
+                <w:color w:val="000000"/>
+                <w:sz w:val="20"/>
+                <w:szCs w:val="20"/>
+              </w:rPr>
+              <w:t xml:space="preserve">0,855</w:t>
+            </w:r>
+          </w:p>
+        </w:tc>
+        <w:tc>
+          <w:tcPr>
+            <w:tcW w:type="dxa" w:w="3100"/>
+            <w:tcMar>
+              <w:top w:type="dxa" w:w="100"/>
+              <w:left w:type="dxa" w:w="120"/>
+              <w:bottom w:type="dxa" w:w="100"/>
+              <w:right w:type="dxa" w:w="120"/>
+            </w:tcMar>
+          </w:tcPr>
+          <w:p>
+            <w:r>
+              <w:rPr>
+                <w:rFonts w:ascii="Calibri" w:cs="Calibri" w:eastAsia="Calibri" w:hAnsi="Calibri"/>
+                <w:b w:val="false"/>
+                <w:bCs w:val="false"/>
+                <w:color w:val="000000"/>
+                <w:sz w:val="20"/>
+                <w:szCs w:val="20"/>
+              </w:rPr>
+              <w:t xml:space="preserve">0,024</w:t>
+            </w:r>
+          </w:p>
+        </w:tc>
+      </w:tr>
+      <w:tr>
+        <w:tc>
+          <w:tcPr>
+            <w:tcW w:type="dxa" w:w="3000"/>
+            <w:tcMar>
+              <w:top w:type="dxa" w:w="100"/>
+              <w:left w:type="dxa" w:w="120"/>
+              <w:bottom w:type="dxa" w:w="100"/>
+              <w:right w:type="dxa" w:w="120"/>
+            </w:tcMar>
+          </w:tcPr>
+          <w:p>
+            <w:r>
+              <w:rPr>
+                <w:rFonts w:ascii="Calibri" w:cs="Calibri" w:eastAsia="Calibri" w:hAnsi="Calibri"/>
+                <w:b w:val="false"/>
+                <w:bCs w:val="false"/>
+                <w:color w:val="000000"/>
+                <w:sz w:val="20"/>
+                <w:szCs w:val="20"/>
+              </w:rPr>
+              <w:t xml:space="preserve">AUC</w:t>
+            </w:r>
+          </w:p>
+        </w:tc>
+        <w:tc>
+          <w:tcPr>
+            <w:tcW w:type="dxa" w:w="3100"/>
+            <w:tcMar>
+              <w:top w:type="dxa" w:w="100"/>
+              <w:left w:type="dxa" w:w="120"/>
+              <w:bottom w:type="dxa" w:w="100"/>
+              <w:right w:type="dxa" w:w="120"/>
+            </w:tcMar>
+          </w:tcPr>
+          <w:p>
+            <w:r>
+              <w:rPr>
+                <w:rFonts w:ascii="Calibri" w:cs="Calibri" w:eastAsia="Calibri" w:hAnsi="Calibri"/>
+                <w:b w:val="false"/>
+                <w:bCs w:val="false"/>
+                <w:color w:val="000000"/>
+                <w:sz w:val="20"/>
+                <w:szCs w:val="20"/>
+              </w:rPr>
+              <w:t xml:space="preserve">0,928</w:t>
+            </w:r>
+          </w:p>
+        </w:tc>
+        <w:tc>
+          <w:tcPr>
+            <w:tcW w:type="dxa" w:w="3100"/>
+            <w:tcMar>
+              <w:top w:type="dxa" w:w="100"/>
+              <w:left w:type="dxa" w:w="120"/>
+              <w:bottom w:type="dxa" w:w="100"/>
+              <w:right w:type="dxa" w:w="120"/>
+            </w:tcMar>
+          </w:tcPr>
+          <w:p>
+            <w:r>
+              <w:rPr>
+                <w:rFonts w:ascii="Calibri" w:cs="Calibri" w:eastAsia="Calibri" w:hAnsi="Calibri"/>
+                <w:b w:val="false"/>
+                <w:bCs w:val="false"/>
+                <w:color w:val="000000"/>
+                <w:sz w:val="20"/>
+                <w:szCs w:val="20"/>
+              </w:rPr>
+              <w:t xml:space="preserve">0,020</w:t>
+            </w:r>
+          </w:p>
+        </w:tc>
+      </w:tr>
+    </w:tbl>
+    <w:p>
+      <w:pPr>
+        <w:spacing w:after="160" w:line="276"/>
+        <w:jc w:val="both"/>
+      </w:pPr>
+      <w:r>
+        <w:rPr>
+          <w:rFonts w:ascii="Calibri" w:cs="Calibri" w:eastAsia="Calibri" w:hAnsi="Calibri"/>
+          <w:i w:val="false"/>
+          <w:iCs w:val="false"/>
+          <w:sz w:val="22"/>
+          <w:szCs w:val="22"/>
+        </w:rPr>
+        <w:t xml:space="preserve">Esses valores são consistentes, em ordem de grandeza, com os 92,3% de acurácia e 0,980 de AUC relatados por Hagen et al. (2024) no nível de gênero, considerando que os dados aqui utilizados são sintéticos e foram desenhados com sobreposição intencional entre classes (para evitar separação artificialmente perfeita), e não o dataset real do artigo.</w:t>
+      </w:r>
+    </w:p>
+    <w:p>
+      <w:pPr>
+        <w:pStyle w:val="Heading2"/>
+        <w:spacing w:after="120" w:before="220"/>
+      </w:pPr>
+      <w:r>
+        <w:rPr>
+          <w:rFonts w:ascii="Calibri" w:cs="Calibri" w:eastAsia="Calibri" w:hAnsi="Calibri"/>
+          <w:b/>
+          <w:bCs/>
+          <w:sz w:val="23"/>
+          <w:szCs w:val="23"/>
+        </w:rPr>
+        <w:t xml:space="preserve">10.4 Táxons marcadores identificados</w:t>
+      </w:r>
+    </w:p>
+    <w:p>
+      <w:pPr>
+        <w:spacing w:after="160" w:line="276"/>
+        <w:jc w:val="both"/>
+      </w:pPr>
+      <w:r>
+        <w:rPr>
+          <w:rFonts w:ascii="Calibri" w:cs="Calibri" w:eastAsia="Calibri" w:hAnsi="Calibri"/>
+          <w:i w:val="false"/>
+          <w:iCs w:val="false"/>
+          <w:sz w:val="22"/>
+          <w:szCs w:val="22"/>
+        </w:rPr>
+        <w:t xml:space="preserve">A tabela a seguir lista os cinco táxons de maior importância SHAP média na execução de referência, com o consenso de direção de enriquecimento entre os folds da validação cruzada:</w:t>
+      </w:r>
+    </w:p>
+    <w:tbl>
+      <w:tblPr>
+        <w:tblW w:type="dxa" w:w="9200"/>
+        <w:tblBorders>
+          <w:top w:val="single" w:color="auto" w:sz="4"/>
+          <w:left w:val="single" w:color="auto" w:sz="4"/>
+          <w:bottom w:val="single" w:color="auto" w:sz="4"/>
+          <w:right w:val="single" w:color="auto" w:sz="4"/>
+          <w:insideH w:val="single" w:color="auto" w:sz="4"/>
+          <w:insideV w:val="single" w:color="auto" w:sz="4"/>
+        </w:tblBorders>
+      </w:tblPr>
+      <w:tblGrid>
+        <w:gridCol w:w="3400"/>
+        <w:gridCol w:w="2900"/>
+        <w:gridCol w:w="2900"/>
+      </w:tblGrid>
+      <w:tr>
+        <w:tc>
+          <w:tcPr>
+            <w:tcW w:type="dxa" w:w="3400"/>
+            <w:shd w:fill="1F3864" w:val="clear"/>
+            <w:tcMar>
+              <w:top w:type="dxa" w:w="100"/>
+              <w:left w:type="dxa" w:w="120"/>
+              <w:bottom w:type="dxa" w:w="100"/>
+              <w:right w:type="dxa" w:w="120"/>
+            </w:tcMar>
+          </w:tcPr>
+          <w:p>
+            <w:r>
+              <w:rPr>
+                <w:rFonts w:ascii="Calibri" w:cs="Calibri" w:eastAsia="Calibri" w:hAnsi="Calibri"/>
+                <w:b/>
+                <w:bCs/>
+                <w:color w:val="FFFFFF"/>
+                <w:sz w:val="20"/>
+                <w:szCs w:val="20"/>
+              </w:rPr>
+              <w:t xml:space="preserve">Táxon</w:t>
+            </w:r>
+          </w:p>
+        </w:tc>
+        <w:tc>
+          <w:tcPr>
+            <w:tcW w:type="dxa" w:w="2900"/>
+            <w:shd w:fill="1F3864" w:val="clear"/>
+            <w:tcMar>
+              <w:top w:type="dxa" w:w="100"/>
+              <w:left w:type="dxa" w:w="120"/>
+              <w:bottom w:type="dxa" w:w="100"/>
+              <w:right w:type="dxa" w:w="120"/>
+            </w:tcMar>
+          </w:tcPr>
+          <w:p>
+            <w:r>
+              <w:rPr>
+                <w:rFonts w:ascii="Calibri" w:cs="Calibri" w:eastAsia="Calibri" w:hAnsi="Calibri"/>
+                <w:b/>
+                <w:bCs/>
+                <w:color w:val="FFFFFF"/>
+                <w:sz w:val="20"/>
+                <w:szCs w:val="20"/>
+              </w:rPr>
+              <w:t xml:space="preserve">Importância SHAP média</w:t>
+            </w:r>
+          </w:p>
+        </w:tc>
+        <w:tc>
+          <w:tcPr>
+            <w:tcW w:type="dxa" w:w="2900"/>
+            <w:shd w:fill="1F3864" w:val="clear"/>
+            <w:tcMar>
+              <w:top w:type="dxa" w:w="100"/>
+              <w:left w:type="dxa" w:w="120"/>
+              <w:bottom w:type="dxa" w:w="100"/>
+              <w:right w:type="dxa" w:w="120"/>
+            </w:tcMar>
+          </w:tcPr>
+          <w:p>
+            <w:r>
+              <w:rPr>
+                <w:rFonts w:ascii="Calibri" w:cs="Calibri" w:eastAsia="Calibri" w:hAnsi="Calibri"/>
+                <w:b/>
+                <w:bCs/>
+                <w:color w:val="FFFFFF"/>
+                <w:sz w:val="20"/>
+                <w:szCs w:val="20"/>
+              </w:rPr>
+              <w:t xml:space="preserve">Enriquecimento (consenso)</w:t>
+            </w:r>
+          </w:p>
+        </w:tc>
+      </w:tr>
+      <w:tr>
+        <w:tc>
+          <w:tcPr>
+            <w:tcW w:type="dxa" w:w="3400"/>
+            <w:tcMar>
+              <w:top w:type="dxa" w:w="100"/>
+              <w:left w:type="dxa" w:w="120"/>
+              <w:bottom w:type="dxa" w:w="100"/>
+              <w:right w:type="dxa" w:w="120"/>
+            </w:tcMar>
+          </w:tcPr>
+          <w:p>
+            <w:r>
+              <w:rPr>
+                <w:rFonts w:ascii="Calibri" w:cs="Calibri" w:eastAsia="Calibri" w:hAnsi="Calibri"/>
+                <w:b w:val="false"/>
+                <w:bCs w:val="false"/>
+                <w:color w:val="000000"/>
+                <w:sz w:val="20"/>
+                <w:szCs w:val="20"/>
+              </w:rPr>
+              <w:t xml:space="preserve">Bacillus</w:t>
+            </w:r>
+          </w:p>
+        </w:tc>
+        <w:tc>
+          <w:tcPr>
+            <w:tcW w:type="dxa" w:w="2900"/>
+            <w:tcMar>
+              <w:top w:type="dxa" w:w="100"/>
+              <w:left w:type="dxa" w:w="120"/>
+              <w:bottom w:type="dxa" w:w="100"/>
+              <w:right w:type="dxa" w:w="120"/>
+            </w:tcMar>
+          </w:tcPr>
+          <w:p>
+            <w:r>
+              <w:rPr>
+                <w:rFonts w:ascii="Calibri" w:cs="Calibri" w:eastAsia="Calibri" w:hAnsi="Calibri"/>
+                <w:b w:val="false"/>
+                <w:bCs w:val="false"/>
+                <w:color w:val="000000"/>
+                <w:sz w:val="20"/>
+                <w:szCs w:val="20"/>
+              </w:rPr>
+              <w:t xml:space="preserve">0,0975</w:t>
+            </w:r>
+          </w:p>
+        </w:tc>
+        <w:tc>
+          <w:tcPr>
+            <w:tcW w:type="dxa" w:w="2900"/>
+            <w:tcMar>
+              <w:top w:type="dxa" w:w="100"/>
+              <w:left w:type="dxa" w:w="120"/>
+              <w:bottom w:type="dxa" w:w="100"/>
+              <w:right w:type="dxa" w:w="120"/>
+            </w:tcMar>
+          </w:tcPr>
+          <w:p>
+            <w:r>
+              <w:rPr>
+                <w:rFonts w:ascii="Calibri" w:cs="Calibri" w:eastAsia="Calibri" w:hAnsi="Calibri"/>
+                <w:b w:val="false"/>
+                <w:bCs w:val="false"/>
+                <w:color w:val="000000"/>
+                <w:sz w:val="20"/>
+                <w:szCs w:val="20"/>
+              </w:rPr>
+              <w:t xml:space="preserve">Seca</w:t>
+            </w:r>
+          </w:p>
+        </w:tc>
+      </w:tr>
+      <w:tr>
+        <w:tc>
+          <w:tcPr>
+            <w:tcW w:type="dxa" w:w="3400"/>
+            <w:tcMar>
+              <w:top w:type="dxa" w:w="100"/>
+              <w:left w:type="dxa" w:w="120"/>
+              <w:bottom w:type="dxa" w:w="100"/>
+              <w:right w:type="dxa" w:w="120"/>
+            </w:tcMar>
+          </w:tcPr>
+          <w:p>
+            <w:r>
+              <w:rPr>
+                <w:rFonts w:ascii="Calibri" w:cs="Calibri" w:eastAsia="Calibri" w:hAnsi="Calibri"/>
+                <w:b w:val="false"/>
+                <w:bCs w:val="false"/>
+                <w:color w:val="000000"/>
+                <w:sz w:val="20"/>
+                <w:szCs w:val="20"/>
+              </w:rPr>
+              <w:t xml:space="preserve">Kribbella</w:t>
+            </w:r>
+          </w:p>
+        </w:tc>
+        <w:tc>
+          <w:tcPr>
+            <w:tcW w:type="dxa" w:w="2900"/>
+            <w:tcMar>
+              <w:top w:type="dxa" w:w="100"/>
+              <w:left w:type="dxa" w:w="120"/>
+              <w:bottom w:type="dxa" w:w="100"/>
+              <w:right w:type="dxa" w:w="120"/>
+            </w:tcMar>
+          </w:tcPr>
+          <w:p>
+            <w:r>
+              <w:rPr>
+                <w:rFonts w:ascii="Calibri" w:cs="Calibri" w:eastAsia="Calibri" w:hAnsi="Calibri"/>
+                <w:b w:val="false"/>
+                <w:bCs w:val="false"/>
+                <w:color w:val="000000"/>
+                <w:sz w:val="20"/>
+                <w:szCs w:val="20"/>
+              </w:rPr>
+              <w:t xml:space="preserve">0,0862</w:t>
+            </w:r>
+          </w:p>
+        </w:tc>
+        <w:tc>
+          <w:tcPr>
+            <w:tcW w:type="dxa" w:w="2900"/>
+            <w:tcMar>
+              <w:top w:type="dxa" w:w="100"/>
+              <w:left w:type="dxa" w:w="120"/>
+              <w:bottom w:type="dxa" w:w="100"/>
+              <w:right w:type="dxa" w:w="120"/>
+            </w:tcMar>
+          </w:tcPr>
+          <w:p>
+            <w:r>
+              <w:rPr>
+                <w:rFonts w:ascii="Calibri" w:cs="Calibri" w:eastAsia="Calibri" w:hAnsi="Calibri"/>
+                <w:b w:val="false"/>
+                <w:bCs w:val="false"/>
+                <w:color w:val="000000"/>
+                <w:sz w:val="20"/>
+                <w:szCs w:val="20"/>
+              </w:rPr>
+              <w:t xml:space="preserve">Controle</w:t>
+            </w:r>
+          </w:p>
+        </w:tc>
+      </w:tr>
+      <w:tr>
+        <w:tc>
+          <w:tcPr>
+            <w:tcW w:type="dxa" w:w="3400"/>
+            <w:tcMar>
+              <w:top w:type="dxa" w:w="100"/>
+              <w:left w:type="dxa" w:w="120"/>
+              <w:bottom w:type="dxa" w:w="100"/>
+              <w:right w:type="dxa" w:w="120"/>
+            </w:tcMar>
+          </w:tcPr>
+          <w:p>
+            <w:r>
+              <w:rPr>
+                <w:rFonts w:ascii="Calibri" w:cs="Calibri" w:eastAsia="Calibri" w:hAnsi="Calibri"/>
+                <w:b w:val="false"/>
+                <w:bCs w:val="false"/>
+                <w:color w:val="000000"/>
+                <w:sz w:val="20"/>
+                <w:szCs w:val="20"/>
+              </w:rPr>
+              <w:t xml:space="preserve">Occallatibacter</w:t>
+            </w:r>
+          </w:p>
+        </w:tc>
+        <w:tc>
+          <w:tcPr>
+            <w:tcW w:type="dxa" w:w="2900"/>
+            <w:tcMar>
+              <w:top w:type="dxa" w:w="100"/>
+              <w:left w:type="dxa" w:w="120"/>
+              <w:bottom w:type="dxa" w:w="100"/>
+              <w:right w:type="dxa" w:w="120"/>
+            </w:tcMar>
+          </w:tcPr>
+          <w:p>
+            <w:r>
+              <w:rPr>
+                <w:rFonts w:ascii="Calibri" w:cs="Calibri" w:eastAsia="Calibri" w:hAnsi="Calibri"/>
+                <w:b w:val="false"/>
+                <w:bCs w:val="false"/>
+                <w:color w:val="000000"/>
+                <w:sz w:val="20"/>
+                <w:szCs w:val="20"/>
+              </w:rPr>
+              <w:t xml:space="preserve">0,0807</w:t>
+            </w:r>
+          </w:p>
+        </w:tc>
+        <w:tc>
+          <w:tcPr>
+            <w:tcW w:type="dxa" w:w="2900"/>
+            <w:tcMar>
+              <w:top w:type="dxa" w:w="100"/>
+              <w:left w:type="dxa" w:w="120"/>
+              <w:bottom w:type="dxa" w:w="100"/>
+              <w:right w:type="dxa" w:w="120"/>
+            </w:tcMar>
+          </w:tcPr>
+          <w:p>
+            <w:r>
+              <w:rPr>
+                <w:rFonts w:ascii="Calibri" w:cs="Calibri" w:eastAsia="Calibri" w:hAnsi="Calibri"/>
+                <w:b w:val="false"/>
+                <w:bCs w:val="false"/>
+                <w:color w:val="000000"/>
+                <w:sz w:val="20"/>
+                <w:szCs w:val="20"/>
+              </w:rPr>
+              <w:t xml:space="preserve">Controle</w:t>
+            </w:r>
+          </w:p>
+        </w:tc>
+      </w:tr>
+      <w:tr>
+        <w:tc>
+          <w:tcPr>
+            <w:tcW w:type="dxa" w:w="3400"/>
+            <w:tcMar>
+              <w:top w:type="dxa" w:w="100"/>
+              <w:left w:type="dxa" w:w="120"/>
+              <w:bottom w:type="dxa" w:w="100"/>
+              <w:right w:type="dxa" w:w="120"/>
+            </w:tcMar>
+          </w:tcPr>
+          <w:p>
+            <w:r>
+              <w:rPr>
+                <w:rFonts w:ascii="Calibri" w:cs="Calibri" w:eastAsia="Calibri" w:hAnsi="Calibri"/>
+                <w:b w:val="false"/>
+                <w:bCs w:val="false"/>
+                <w:color w:val="000000"/>
+                <w:sz w:val="20"/>
+                <w:szCs w:val="20"/>
+              </w:rPr>
+              <w:t xml:space="preserve">Streptomyces</w:t>
+            </w:r>
+          </w:p>
+        </w:tc>
+        <w:tc>
+          <w:tcPr>
+            <w:tcW w:type="dxa" w:w="2900"/>
+            <w:tcMar>
+              <w:top w:type="dxa" w:w="100"/>
+              <w:left w:type="dxa" w:w="120"/>
+              <w:bottom w:type="dxa" w:w="100"/>
+              <w:right w:type="dxa" w:w="120"/>
+            </w:tcMar>
+          </w:tcPr>
+          <w:p>
+            <w:r>
+              <w:rPr>
+                <w:rFonts w:ascii="Calibri" w:cs="Calibri" w:eastAsia="Calibri" w:hAnsi="Calibri"/>
+                <w:b w:val="false"/>
+                <w:bCs w:val="false"/>
+                <w:color w:val="000000"/>
+                <w:sz w:val="20"/>
+                <w:szCs w:val="20"/>
+              </w:rPr>
+              <w:t xml:space="preserve">0,0794</w:t>
+            </w:r>
+          </w:p>
+        </w:tc>
+        <w:tc>
+          <w:tcPr>
+            <w:tcW w:type="dxa" w:w="2900"/>
+            <w:tcMar>
+              <w:top w:type="dxa" w:w="100"/>
+              <w:left w:type="dxa" w:w="120"/>
+              <w:bottom w:type="dxa" w:w="100"/>
+              <w:right w:type="dxa" w:w="120"/>
+            </w:tcMar>
+          </w:tcPr>
+          <w:p>
+            <w:r>
+              <w:rPr>
+                <w:rFonts w:ascii="Calibri" w:cs="Calibri" w:eastAsia="Calibri" w:hAnsi="Calibri"/>
+                <w:b w:val="false"/>
+                <w:bCs w:val="false"/>
+                <w:color w:val="000000"/>
+                <w:sz w:val="20"/>
+                <w:szCs w:val="20"/>
+              </w:rPr>
+              <w:t xml:space="preserve">Seca</w:t>
+            </w:r>
+          </w:p>
+        </w:tc>
+      </w:tr>
+      <w:tr>
+        <w:tc>
+          <w:tcPr>
+            <w:tcW w:type="dxa" w:w="3400"/>
+            <w:tcMar>
+              <w:top w:type="dxa" w:w="100"/>
+              <w:left w:type="dxa" w:w="120"/>
+              <w:bottom w:type="dxa" w:w="100"/>
+              <w:right w:type="dxa" w:w="120"/>
+            </w:tcMar>
+          </w:tcPr>
+          <w:p>
+            <w:r>
+              <w:rPr>
+                <w:rFonts w:ascii="Calibri" w:cs="Calibri" w:eastAsia="Calibri" w:hAnsi="Calibri"/>
+                <w:b w:val="false"/>
+                <w:bCs w:val="false"/>
+                <w:color w:val="000000"/>
+                <w:sz w:val="20"/>
+                <w:szCs w:val="20"/>
+              </w:rPr>
+              <w:t xml:space="preserve">Genus_035</w:t>
+            </w:r>
+          </w:p>
+        </w:tc>
+        <w:tc>
+          <w:tcPr>
+            <w:tcW w:type="dxa" w:w="2900"/>
+            <w:tcMar>
+              <w:top w:type="dxa" w:w="100"/>
+              <w:left w:type="dxa" w:w="120"/>
+              <w:bottom w:type="dxa" w:w="100"/>
+              <w:right w:type="dxa" w:w="120"/>
+            </w:tcMar>
+          </w:tcPr>
+          <w:p>
+            <w:r>
+              <w:rPr>
+                <w:rFonts w:ascii="Calibri" w:cs="Calibri" w:eastAsia="Calibri" w:hAnsi="Calibri"/>
+                <w:b w:val="false"/>
+                <w:bCs w:val="false"/>
+                <w:color w:val="000000"/>
+                <w:sz w:val="20"/>
+                <w:szCs w:val="20"/>
+              </w:rPr>
+              <w:t xml:space="preserve">0,0066</w:t>
+            </w:r>
+          </w:p>
+        </w:tc>
+        <w:tc>
+          <w:tcPr>
+            <w:tcW w:type="dxa" w:w="2900"/>
+            <w:tcMar>
+              <w:top w:type="dxa" w:w="100"/>
+              <w:left w:type="dxa" w:w="120"/>
+              <w:bottom w:type="dxa" w:w="100"/>
+              <w:right w:type="dxa" w:w="120"/>
+            </w:tcMar>
+          </w:tcPr>
+          <w:p>
+            <w:r>
+              <w:rPr>
+                <w:rFonts w:ascii="Calibri" w:cs="Calibri" w:eastAsia="Calibri" w:hAnsi="Calibri"/>
+                <w:b w:val="false"/>
+                <w:bCs w:val="false"/>
+                <w:color w:val="000000"/>
+                <w:sz w:val="20"/>
+                <w:szCs w:val="20"/>
+              </w:rPr>
+              <w:t xml:space="preserve">Seca</w:t>
+            </w:r>
+          </w:p>
+        </w:tc>
+      </w:tr>
+    </w:tbl>
+    <w:p>
+      <w:pPr>
+        <w:spacing w:after="160" w:line="276"/>
+        <w:jc w:val="both"/>
+      </w:pPr>
+      <w:r>
+        <w:rPr>
+          <w:rFonts w:ascii="Calibri" w:cs="Calibri" w:eastAsia="Calibri" w:hAnsi="Calibri"/>
+          <w:i w:val="false"/>
+          <w:iCs w:val="false"/>
+          <w:sz w:val="22"/>
+          <w:szCs w:val="22"/>
+        </w:rPr>
+        <w:t xml:space="preserve">O consenso de enriquecimento foi calculado a partir da correlação, em cada fold, entre o valor bruto de abundância de cada táxon e seu respectivo valor SHAP para a classe "Seca": correlação positiva indica enriquecimento sob seca, negativa indica enriquecimento sob controle. Um táxon só recebe rótulo definitivo quando essa direção é consistente em pelo menos 4 dos 5 folds, replicando o critério de consenso do artigo de referência.</w:t>
+      </w:r>
+    </w:p>
+    <w:p>
+      <w:pPr>
+        <w:pStyle w:val="Heading2"/>
+        <w:spacing w:after="120" w:before="220"/>
+      </w:pPr>
+      <w:r>
+        <w:rPr>
+          <w:rFonts w:ascii="Calibri" w:cs="Calibri" w:eastAsia="Calibri" w:hAnsi="Calibri"/>
+          <w:b/>
+          <w:bCs/>
+          <w:sz w:val="23"/>
+          <w:szCs w:val="23"/>
+        </w:rPr>
+        <w:t xml:space="preserve">10.5 Mapa de prescrição e simulação de taxa variável</w:t>
+      </w:r>
+    </w:p>
+    <w:p>
+      <w:pPr>
+        <w:spacing w:after="160" w:line="276"/>
+        <w:jc w:val="both"/>
+      </w:pPr>
+      <w:r>
+        <w:rPr>
+          <w:rFonts w:ascii="Calibri" w:cs="Calibri" w:eastAsia="Calibri" w:hAnsi="Calibri"/>
+          <w:i w:val="false"/>
+          <w:iCs w:val="false"/>
+          <w:sz w:val="22"/>
+          <w:szCs w:val="22"/>
+        </w:rPr>
+        <w:t xml:space="preserve">A saída do classificador foi convertida em um mapa de prescrição (função probabilidade → dose → composição, seção 5.4) e interpolada para uma grade regular representando um talhão hipotético de 25 hectares. A Figura 1 mostra o mapa resultante, com a dose de bioinsumo (L/ha) por célula da grade.</w:t>
+      </w:r>
+    </w:p>
+    <w:p>
+      <w:pPr>
+        <w:spacing w:after="40" w:before="120"/>
+        <w:jc w:val="center"/>
+      </w:pPr>
+      <w:r>
+        <w:drawing>
+          <wp:inline distT="0" distB="0" distL="0" distR="0">
+            <wp:extent cx="3619500" cy="3019425"/>
+            <wp:effectExtent t="0" r="0" b="0" l="0"/>
+            <wp:docPr id="1" name="" descr="" title=""/>
+            <wp:cNvGraphicFramePr>
+              <a:graphicFrameLocks xmlns:a="http://schemas.openxmlformats.org/drawingml/2006/main" noChangeAspect="1"/>
+            </wp:cNvGraphicFramePr>
+            <a:graphic xmlns:a="http://schemas.openxmlformats.org/drawingml/2006/main">
+              <a:graphicData uri="http://schemas.openxmlformats.org/drawingml/2006/picture">
+                <pic:pic xmlns:pic="http://schemas.openxmlformats.org/drawingml/2006/picture">
+                  <pic:nvPicPr>
+                    <pic:cNvPr id="0" name="" descr=""/>
+                    <pic:cNvPicPr>
+                      <a:picLocks noChangeAspect="1" noChangeArrowheads="1"/>
+                    </pic:cNvPicPr>
+                  </pic:nvPicPr>
+                  <pic:blipFill>
+                    <a:blip r:embed="rId8" cstate="none"/>
+                    <a:srcRect/>
+                    <a:stretch>
+                      <a:fillRect/>
+                    </a:stretch>
+                  </pic:blipFill>
+                  <pic:spPr bwMode="auto">
+                    <a:xfrm>
+                      <a:off x="0" y="0"/>
+                      <a:ext cx="3619500" cy="3019425"/>
+                    </a:xfrm>
+                    <a:prstGeom prst="rect">
+                      <a:avLst/>
+                    </a:prstGeom>
+                  </pic:spPr>
+                </pic:pic>
+              </a:graphicData>
+            </a:graphic>
+          </wp:inline>
+        </w:drawing>
+      </w:r>
+    </w:p>
+    <w:p>
+      <w:pPr>
+        <w:spacing w:after="200"/>
+        <w:jc w:val="center"/>
+      </w:pPr>
+      <w:r>
+        <w:rPr>
+          <w:rFonts w:ascii="Calibri" w:cs="Calibri" w:eastAsia="Calibri" w:hAnsi="Calibri"/>
+          <w:i/>
+          <w:iCs/>
+          <w:sz w:val="19"/>
+          <w:szCs w:val="19"/>
+        </w:rPr>
+        <w:t xml:space="preserve">Figura 1: Mapa de prescrição simulado (dose de bioinsumo, L/ha) para um talhão de 25 ha.</w:t>
+      </w:r>
+    </w:p>
+    <w:p>
+      <w:pPr>
+        <w:spacing w:after="160" w:line="276"/>
+        <w:jc w:val="both"/>
+      </w:pPr>
+      <w:r>
+        <w:rPr>
+          <w:rFonts w:ascii="Calibri" w:cs="Calibri" w:eastAsia="Calibri" w:hAnsi="Calibri"/>
+          <w:i w:val="false"/>
+          <w:iCs w:val="false"/>
+          <w:sz w:val="22"/>
+          <w:szCs w:val="22"/>
+        </w:rPr>
+        <w:t xml:space="preserve">A simulação de aplicação comparou o volume total de bioinsumo em dois cenários: aplicação uniforme (dose fixa de 40 L/ha em toda a área, correspondente à dose máxima do mapa de prescrição) e aplicação em taxa variável guiada pelo mapa. Os resultados foram: volume uniforme de 1.000 L para os 25 ha simulados, contra 480,5 L em taxa variável, uma economia estimada de 51,9% de bioinsumo. Esse resultado deve ser lido como uma estimativa de ordem de grandeza, condicionada à proporção de área classificada como estressada nos dados sintéticos utilizados, e não como uma previsão de economia para um talhão real.</w:t>
+      </w:r>
+    </w:p>
+    <w:p>
+      <w:pPr>
+        <w:pStyle w:val="Heading2"/>
+        <w:spacing w:after="120" w:before="220"/>
+      </w:pPr>
+      <w:r>
+        <w:rPr>
+          <w:rFonts w:ascii="Calibri" w:cs="Calibri" w:eastAsia="Calibri" w:hAnsi="Calibri"/>
+          <w:b/>
+          <w:bCs/>
+          <w:sz w:val="23"/>
+          <w:szCs w:val="23"/>
+        </w:rPr>
+        <w:t xml:space="preserve">10.6 Disponibilidade do código</w:t>
+      </w:r>
+    </w:p>
+    <w:p>
+      <w:pPr>
+        <w:spacing w:after="160" w:line="276"/>
+        <w:jc w:val="both"/>
+      </w:pPr>
+      <w:r>
+        <w:rPr>
+          <w:rFonts w:ascii="Calibri" w:cs="Calibri" w:eastAsia="Calibri" w:hAnsi="Calibri"/>
+          <w:i w:val="false"/>
+          <w:iCs w:val="false"/>
+          <w:sz w:val="22"/>
+          <w:szCs w:val="22"/>
+        </w:rPr>
+        <w:t xml:space="preserve">O código-fonte completo (módulos, testes automatizados e um exemplo de execução já processado, incluindo os artefatos citados nesta seção) está organizado como um repositório Git, pronto para publicação no GitHub associado a esta disciplina.</w:t>
       </w:r>
     </w:p>
     <w:p>

</xml_diff>